<commit_message>
Add editable tasks and refill logo image
</commit_message>
<xml_diff>
--- a/docs/ACOB_IT0049_TFA3_MakingItEditable.docx
+++ b/docs/ACOB_IT0049_TFA3_MakingItEditable.docx
@@ -541,7 +541,7 @@
                 <w:color w:val="000000"/>
                 <w:sz w:val="20"/>
               </w:rPr>
-              <w:t>I continued my TSA1 Ledgerline Refill project, keeping its task pages and refill-shop design. I added validated customer and staff forms, account editing, and profile picture uploads to the POS directories.</w:t>
+              <w:t>I continued my TSA1 Ledgerline Refill project and its refill-shop design. I added validated customer and staff forms, profile picture uploads, and task creation, editing, and deletion. A bottle-and-return logo image now appears in the header.</w:t>
             </w:r>
           </w:p>
         </w:tc>
@@ -898,7 +898,127 @@
                 <w:color w:val="000000"/>
                 <w:sz w:val="20"/>
               </w:rPr>
-              <w:t>All nine task records in date order</w:t>
+              <w:t>All task records in date order with edit actions</w:t>
+            </w:r>
+          </w:p>
+        </w:tc>
+      </w:tr>
+      <w:tr>
+        <w:trPr>
+          <w:cantSplit/>
+        </w:trPr>
+        <w:tc>
+          <w:tcPr>
+            <w:tcW w:type="dxa" w:w="3024"/>
+            <w:shd w:fill="E6F1EC"/>
+            <w:vAlign w:val="center"/>
+            <w:tcMar>
+              <w:top w:w="90" w:type="dxa"/>
+              <w:start w:w="110" w:type="dxa"/>
+              <w:bottom w:w="90" w:type="dxa"/>
+              <w:end w:w="110" w:type="dxa"/>
+            </w:tcMar>
+          </w:tcPr>
+          <w:p>
+            <w:pPr>
+              <w:spacing w:after="0" w:before="0"/>
+            </w:pPr>
+            <w:r/>
+            <w:r>
+              <w:rPr>
+                <w:rFonts w:ascii="Times New Roman" w:hAnsi="Times New Roman"/>
+                <w:b w:val="0"/>
+                <w:color w:val="000000"/>
+                <w:sz w:val="20"/>
+              </w:rPr>
+              <w:t>/tasks/new and /tasks/{id}/edit</w:t>
+            </w:r>
+          </w:p>
+        </w:tc>
+        <w:tc>
+          <w:tcPr>
+            <w:tcW w:type="dxa" w:w="6336"/>
+            <w:shd w:fill="E6F1EC"/>
+            <w:vAlign w:val="center"/>
+            <w:tcMar>
+              <w:top w:w="90" w:type="dxa"/>
+              <w:start w:w="110" w:type="dxa"/>
+              <w:bottom w:w="90" w:type="dxa"/>
+              <w:end w:w="110" w:type="dxa"/>
+            </w:tcMar>
+          </w:tcPr>
+          <w:p>
+            <w:pPr>
+              <w:spacing w:after="0" w:before="0"/>
+            </w:pPr>
+            <w:r/>
+            <w:r>
+              <w:rPr>
+                <w:rFonts w:ascii="Times New Roman" w:hAnsi="Times New Roman"/>
+                <w:b w:val="0"/>
+                <w:color w:val="000000"/>
+                <w:sz w:val="20"/>
+              </w:rPr>
+              <w:t>Validated task creation and prefilled editing</w:t>
+            </w:r>
+          </w:p>
+        </w:tc>
+      </w:tr>
+      <w:tr>
+        <w:trPr>
+          <w:cantSplit/>
+        </w:trPr>
+        <w:tc>
+          <w:tcPr>
+            <w:tcW w:type="dxa" w:w="3024"/>
+            <w:vAlign w:val="center"/>
+            <w:tcMar>
+              <w:top w:w="90" w:type="dxa"/>
+              <w:start w:w="110" w:type="dxa"/>
+              <w:bottom w:w="90" w:type="dxa"/>
+              <w:end w:w="110" w:type="dxa"/>
+            </w:tcMar>
+          </w:tcPr>
+          <w:p>
+            <w:pPr>
+              <w:spacing w:after="0" w:before="0"/>
+            </w:pPr>
+            <w:r/>
+            <w:r>
+              <w:rPr>
+                <w:rFonts w:ascii="Times New Roman" w:hAnsi="Times New Roman"/>
+                <w:b w:val="0"/>
+                <w:color w:val="000000"/>
+                <w:sz w:val="20"/>
+              </w:rPr>
+              <w:t>/tasks/{id}/delete</w:t>
+            </w:r>
+          </w:p>
+        </w:tc>
+        <w:tc>
+          <w:tcPr>
+            <w:tcW w:type="dxa" w:w="6336"/>
+            <w:vAlign w:val="center"/>
+            <w:tcMar>
+              <w:top w:w="90" w:type="dxa"/>
+              <w:start w:w="110" w:type="dxa"/>
+              <w:bottom w:w="90" w:type="dxa"/>
+              <w:end w:w="110" w:type="dxa"/>
+            </w:tcMar>
+          </w:tcPr>
+          <w:p>
+            <w:pPr>
+              <w:spacing w:after="0" w:before="0"/>
+            </w:pPr>
+            <w:r/>
+            <w:r>
+              <w:rPr>
+                <w:rFonts w:ascii="Times New Roman" w:hAnsi="Times New Roman"/>
+                <w:b w:val="0"/>
+                <w:color w:val="000000"/>
+                <w:sz w:val="20"/>
+              </w:rPr>
+              <w:t>CSRF-protected task deletion with a browser confirmation</w:t>
             </w:r>
           </w:p>
         </w:tc>
@@ -1515,7 +1635,7 @@
                 <w:color w:val="000000"/>
                 <w:sz w:val="20"/>
               </w:rPr>
-              <w:t>Figure 2. Complete task list remains available beside the new account features.</w:t>
+              <w:t>Figure 2. Complete task list now offers New task and Edit actions.</w:t>
             </w:r>
           </w:p>
         </w:tc>
@@ -2535,6 +2655,449 @@
         <w:gridCol w:w="9458"/>
       </w:tblGrid>
       <w:tr>
+        <w:tc>
+          <w:tcPr>
+            <w:tcW w:type="dxa" w:w="9458"/>
+            <w:shd w:fill="006B35"/>
+            <w:vAlign w:val="center"/>
+            <w:tcMar>
+              <w:top w:w="120" w:type="dxa"/>
+              <w:start w:w="135" w:type="dxa"/>
+              <w:bottom w:w="120" w:type="dxa"/>
+              <w:end w:w="135" w:type="dxa"/>
+            </w:tcMar>
+          </w:tcPr>
+          <w:p>
+            <w:pPr>
+              <w:spacing w:after="0" w:before="0"/>
+            </w:pPr>
+            <w:r/>
+            <w:r>
+              <w:rPr>
+                <w:rFonts w:ascii="Times New Roman" w:hAnsi="Times New Roman"/>
+                <w:b/>
+                <w:color w:val="FFFFFF"/>
+                <w:sz w:val="28"/>
+              </w:rPr>
+              <w:t>Task Management Extension</w:t>
+            </w:r>
+          </w:p>
+        </w:tc>
+      </w:tr>
+    </w:tbl>
+    <w:p>
+      <w:pPr>
+        <w:spacing w:after="40"/>
+      </w:pPr>
+    </w:p>
+    <w:tbl>
+      <w:tblPr>
+        <w:tblW w:type="auto" w:w="0"/>
+        <w:tblLayout w:type="fixed"/>
+        <w:tblLook w:firstColumn="1" w:firstRow="1" w:lastColumn="0" w:lastRow="0" w:noHBand="0" w:noVBand="1" w:val="04A0"/>
+      </w:tblPr>
+      <w:tblGrid>
+        <w:gridCol w:w="9458"/>
+      </w:tblGrid>
+      <w:tr>
+        <w:trPr>
+          <w:cantSplit/>
+        </w:trPr>
+        <w:tc>
+          <w:tcPr>
+            <w:tcW w:type="dxa" w:w="9458"/>
+            <w:tcMar>
+              <w:top w:w="100" w:type="dxa"/>
+              <w:start w:w="80" w:type="dxa"/>
+              <w:bottom w:w="90" w:type="dxa"/>
+              <w:end w:w="80" w:type="dxa"/>
+            </w:tcMar>
+          </w:tcPr>
+          <w:p>
+            <w:pPr>
+              <w:keepNext/>
+              <w:spacing w:after="0"/>
+              <w:jc w:val="center"/>
+            </w:pPr>
+            <w:r/>
+            <w:r>
+              <w:drawing>
+                <wp:inline>
+                  <wp:extent cx="4617720" cy="3944302"/>
+                  <wp:docPr id="12" name="Picture 12"/>
+                  <wp:cNvGraphicFramePr>
+                    <a:graphicFrameLocks noChangeAspect="1"/>
+                  </wp:cNvGraphicFramePr>
+                  <a:graphic>
+                    <a:graphicData uri="http://schemas.openxmlformats.org/drawingml/2006/picture">
+                      <pic:pic>
+                        <pic:nvPicPr>
+                          <pic:cNvPr id="0" name="figure-15-new-task.png"/>
+                          <pic:cNvPicPr/>
+                        </pic:nvPicPr>
+                        <pic:blipFill>
+                          <a:blip r:embed="rId26"/>
+                          <a:stretch>
+                            <a:fillRect/>
+                          </a:stretch>
+                        </pic:blipFill>
+                        <pic:spPr>
+                          <a:xfrm>
+                            <a:off x="0" y="0"/>
+                            <a:ext cx="4617720" cy="3944302"/>
+                          </a:xfrm>
+                          <a:prstGeom prst="rect"/>
+                        </pic:spPr>
+                      </pic:pic>
+                    </a:graphicData>
+                  </a:graphic>
+                </wp:inline>
+              </w:drawing>
+            </w:r>
+          </w:p>
+        </w:tc>
+      </w:tr>
+      <w:tr>
+        <w:trPr>
+          <w:cantSplit/>
+        </w:trPr>
+        <w:tc>
+          <w:tcPr>
+            <w:tcW w:type="dxa" w:w="9458"/>
+            <w:shd w:fill="E6F1EC"/>
+            <w:vAlign w:val="center"/>
+            <w:tcMar>
+              <w:top w:w="90" w:type="dxa"/>
+              <w:start w:w="110" w:type="dxa"/>
+              <w:bottom w:w="90" w:type="dxa"/>
+              <w:end w:w="110" w:type="dxa"/>
+            </w:tcMar>
+          </w:tcPr>
+          <w:p>
+            <w:pPr>
+              <w:spacing w:after="0" w:before="0"/>
+            </w:pPr>
+            <w:r/>
+            <w:r>
+              <w:rPr>
+                <w:rFonts w:ascii="Times New Roman" w:hAnsi="Times New Roman"/>
+                <w:b w:val="0"/>
+                <w:color w:val="000000"/>
+                <w:sz w:val="20"/>
+              </w:rPr>
+              <w:t>Figure 12. The new task form accepts a title, scheduled date, and status.</w:t>
+            </w:r>
+          </w:p>
+        </w:tc>
+      </w:tr>
+    </w:tbl>
+    <w:p>
+      <w:pPr>
+        <w:spacing w:after="20"/>
+      </w:pPr>
+    </w:p>
+    <w:tbl>
+      <w:tblPr>
+        <w:tblW w:type="auto" w:w="0"/>
+        <w:tblLayout w:type="fixed"/>
+        <w:tblLook w:firstColumn="1" w:firstRow="1" w:lastColumn="0" w:lastRow="0" w:noHBand="0" w:noVBand="1" w:val="04A0"/>
+      </w:tblPr>
+      <w:tblGrid>
+        <w:gridCol w:w="9458"/>
+      </w:tblGrid>
+      <w:tr>
+        <w:trPr>
+          <w:cantSplit/>
+        </w:trPr>
+        <w:tc>
+          <w:tcPr>
+            <w:tcW w:type="dxa" w:w="9458"/>
+            <w:tcMar>
+              <w:top w:w="100" w:type="dxa"/>
+              <w:start w:w="80" w:type="dxa"/>
+              <w:bottom w:w="90" w:type="dxa"/>
+              <w:end w:w="80" w:type="dxa"/>
+            </w:tcMar>
+          </w:tcPr>
+          <w:p>
+            <w:pPr>
+              <w:keepNext/>
+              <w:spacing w:after="0"/>
+              <w:jc w:val="center"/>
+            </w:pPr>
+            <w:r/>
+            <w:r>
+              <w:drawing>
+                <wp:inline>
+                  <wp:extent cx="4617720" cy="4123880"/>
+                  <wp:docPr id="13" name="Picture 13"/>
+                  <wp:cNvGraphicFramePr>
+                    <a:graphicFrameLocks noChangeAspect="1"/>
+                  </wp:cNvGraphicFramePr>
+                  <a:graphic>
+                    <a:graphicData uri="http://schemas.openxmlformats.org/drawingml/2006/picture">
+                      <pic:pic>
+                        <pic:nvPicPr>
+                          <pic:cNvPr id="0" name="figure-16-edit-task.png"/>
+                          <pic:cNvPicPr/>
+                        </pic:nvPicPr>
+                        <pic:blipFill>
+                          <a:blip r:embed="rId27"/>
+                          <a:stretch>
+                            <a:fillRect/>
+                          </a:stretch>
+                        </pic:blipFill>
+                        <pic:spPr>
+                          <a:xfrm>
+                            <a:off x="0" y="0"/>
+                            <a:ext cx="4617720" cy="4123880"/>
+                          </a:xfrm>
+                          <a:prstGeom prst="rect"/>
+                        </pic:spPr>
+                      </pic:pic>
+                    </a:graphicData>
+                  </a:graphic>
+                </wp:inline>
+              </w:drawing>
+            </w:r>
+          </w:p>
+        </w:tc>
+      </w:tr>
+      <w:tr>
+        <w:trPr>
+          <w:cantSplit/>
+        </w:trPr>
+        <w:tc>
+          <w:tcPr>
+            <w:tcW w:type="dxa" w:w="9458"/>
+            <w:shd w:fill="E6F1EC"/>
+            <w:vAlign w:val="center"/>
+            <w:tcMar>
+              <w:top w:w="90" w:type="dxa"/>
+              <w:start w:w="110" w:type="dxa"/>
+              <w:bottom w:w="90" w:type="dxa"/>
+              <w:end w:w="110" w:type="dxa"/>
+            </w:tcMar>
+          </w:tcPr>
+          <w:p>
+            <w:pPr>
+              <w:spacing w:after="0" w:before="0"/>
+            </w:pPr>
+            <w:r/>
+            <w:r>
+              <w:rPr>
+                <w:rFonts w:ascii="Times New Roman" w:hAnsi="Times New Roman"/>
+                <w:b w:val="0"/>
+                <w:color w:val="000000"/>
+                <w:sz w:val="20"/>
+              </w:rPr>
+              <w:t>Figure 13. The task edit form loads an existing record and offers Save changes and Delete task.</w:t>
+            </w:r>
+          </w:p>
+        </w:tc>
+      </w:tr>
+    </w:tbl>
+    <w:p>
+      <w:pPr>
+        <w:spacing w:after="20"/>
+      </w:pPr>
+    </w:p>
+    <w:tbl>
+      <w:tblPr>
+        <w:tblW w:type="auto" w:w="0"/>
+        <w:tblLayout w:type="fixed"/>
+        <w:tblLook w:firstColumn="1" w:firstRow="1" w:lastColumn="0" w:lastRow="0" w:noHBand="0" w:noVBand="1" w:val="04A0"/>
+      </w:tblPr>
+      <w:tblGrid>
+        <w:gridCol w:w="9458"/>
+      </w:tblGrid>
+      <w:tr>
+        <w:trPr>
+          <w:cantSplit/>
+        </w:trPr>
+        <w:tc>
+          <w:tcPr>
+            <w:tcW w:type="dxa" w:w="9458"/>
+            <w:tcMar>
+              <w:top w:w="100" w:type="dxa"/>
+              <w:start w:w="80" w:type="dxa"/>
+              <w:bottom w:w="90" w:type="dxa"/>
+              <w:end w:w="80" w:type="dxa"/>
+            </w:tcMar>
+          </w:tcPr>
+          <w:p>
+            <w:pPr>
+              <w:keepNext/>
+              <w:spacing w:after="0"/>
+              <w:jc w:val="center"/>
+            </w:pPr>
+            <w:r/>
+            <w:r>
+              <w:drawing>
+                <wp:inline>
+                  <wp:extent cx="2423160" cy="8847641"/>
+                  <wp:docPr id="14" name="Picture 14"/>
+                  <wp:cNvGraphicFramePr>
+                    <a:graphicFrameLocks noChangeAspect="1"/>
+                  </wp:cNvGraphicFramePr>
+                  <a:graphic>
+                    <a:graphicData uri="http://schemas.openxmlformats.org/drawingml/2006/picture">
+                      <pic:pic>
+                        <pic:nvPicPr>
+                          <pic:cNvPr id="0" name="figure-17-mobile-task-edit.png"/>
+                          <pic:cNvPicPr/>
+                        </pic:nvPicPr>
+                        <pic:blipFill>
+                          <a:blip r:embed="rId28"/>
+                          <a:stretch>
+                            <a:fillRect/>
+                          </a:stretch>
+                        </pic:blipFill>
+                        <pic:spPr>
+                          <a:xfrm>
+                            <a:off x="0" y="0"/>
+                            <a:ext cx="2423160" cy="8847641"/>
+                          </a:xfrm>
+                          <a:prstGeom prst="rect"/>
+                        </pic:spPr>
+                      </pic:pic>
+                    </a:graphicData>
+                  </a:graphic>
+                </wp:inline>
+              </w:drawing>
+            </w:r>
+          </w:p>
+        </w:tc>
+      </w:tr>
+      <w:tr>
+        <w:trPr>
+          <w:cantSplit/>
+        </w:trPr>
+        <w:tc>
+          <w:tcPr>
+            <w:tcW w:type="dxa" w:w="9458"/>
+            <w:shd w:fill="E6F1EC"/>
+            <w:vAlign w:val="center"/>
+            <w:tcMar>
+              <w:top w:w="90" w:type="dxa"/>
+              <w:start w:w="110" w:type="dxa"/>
+              <w:bottom w:w="90" w:type="dxa"/>
+              <w:end w:w="110" w:type="dxa"/>
+            </w:tcMar>
+          </w:tcPr>
+          <w:p>
+            <w:pPr>
+              <w:spacing w:after="0" w:before="0"/>
+            </w:pPr>
+            <w:r/>
+            <w:r>
+              <w:rPr>
+                <w:rFonts w:ascii="Times New Roman" w:hAnsi="Times New Roman"/>
+                <w:b w:val="0"/>
+                <w:color w:val="000000"/>
+                <w:sz w:val="20"/>
+              </w:rPr>
+              <w:t>Figure 14. Task editing remains usable at 390 pixels without horizontal overflow.</w:t>
+            </w:r>
+          </w:p>
+        </w:tc>
+      </w:tr>
+    </w:tbl>
+    <w:p>
+      <w:pPr>
+        <w:spacing w:after="20"/>
+      </w:pPr>
+    </w:p>
+    <w:tbl>
+      <w:tblPr>
+        <w:tblW w:type="auto" w:w="0"/>
+        <w:tblLayout w:type="fixed"/>
+        <w:tblLook w:firstColumn="1" w:firstRow="1" w:lastColumn="0" w:lastRow="0" w:noHBand="0" w:noVBand="1" w:val="04A0"/>
+      </w:tblPr>
+      <w:tblGrid>
+        <w:gridCol w:w="9458"/>
+      </w:tblGrid>
+      <w:tr>
+        <w:trPr>
+          <w:cantSplit/>
+        </w:trPr>
+        <w:tc>
+          <w:tcPr>
+            <w:tcW w:type="dxa" w:w="9458"/>
+            <w:shd w:fill="E6F1EC"/>
+            <w:vAlign w:val="center"/>
+            <w:tcMar>
+              <w:top w:w="90" w:type="dxa"/>
+              <w:start w:w="110" w:type="dxa"/>
+              <w:bottom w:w="90" w:type="dxa"/>
+              <w:end w:w="110" w:type="dxa"/>
+            </w:tcMar>
+          </w:tcPr>
+          <w:p>
+            <w:pPr>
+              <w:spacing w:after="0" w:before="0"/>
+            </w:pPr>
+            <w:r/>
+            <w:r>
+              <w:rPr>
+                <w:rFonts w:ascii="Times New Roman" w:hAnsi="Times New Roman"/>
+                <w:b/>
+                <w:color w:val="000000"/>
+                <w:sz w:val="21"/>
+              </w:rPr>
+              <w:t>Task write flow</w:t>
+            </w:r>
+          </w:p>
+        </w:tc>
+      </w:tr>
+      <w:tr>
+        <w:trPr>
+          <w:cantSplit/>
+        </w:trPr>
+        <w:tc>
+          <w:tcPr>
+            <w:tcW w:type="dxa" w:w="9458"/>
+            <w:vAlign w:val="center"/>
+            <w:tcMar>
+              <w:top w:w="90" w:type="dxa"/>
+              <w:start w:w="110" w:type="dxa"/>
+              <w:bottom w:w="90" w:type="dxa"/>
+              <w:end w:w="110" w:type="dxa"/>
+            </w:tcMar>
+          </w:tcPr>
+          <w:p>
+            <w:pPr>
+              <w:spacing w:after="0" w:before="0"/>
+            </w:pPr>
+            <w:r/>
+            <w:r>
+              <w:rPr>
+                <w:rFonts w:ascii="Times New Roman" w:hAnsi="Times New Roman"/>
+                <w:b w:val="0"/>
+                <w:color w:val="000000"/>
+                <w:sz w:val="20"/>
+              </w:rPr>
+              <w:t>The Tasks controller validates the title, date, and allowed status before saving in the separate task database. Deletion uses a POST route with CSRF protection and a confirmation. The Today page updates from the current task rows.</w:t>
+            </w:r>
+          </w:p>
+        </w:tc>
+      </w:tr>
+    </w:tbl>
+    <w:p>
+      <w:pPr>
+        <w:spacing w:after="20"/>
+      </w:pPr>
+    </w:p>
+    <w:tbl>
+      <w:tblPr>
+        <w:tblW w:type="auto" w:w="0"/>
+        <w:tblLayout w:type="fixed"/>
+        <w:tblLook w:firstColumn="1" w:firstRow="1" w:lastColumn="0" w:lastRow="0" w:noHBand="0" w:noVBand="1" w:val="04A0"/>
+      </w:tblPr>
+      <w:tblGrid>
+        <w:gridCol w:w="9458"/>
+      </w:tblGrid>
+      <w:tr>
         <w:trPr>
           <w:cantSplit/>
         </w:trPr>
@@ -3214,7 +3777,7 @@
                 <w:color w:val="000000"/>
                 <w:sz w:val="20"/>
               </w:rPr>
-              <w:t>Read task and profile records from the separate taskStore database.</w:t>
+              <w:t>Read and save task records, and read the demo profile, in the separate taskStore database.</w:t>
             </w:r>
           </w:p>
         </w:tc>
@@ -3558,7 +4121,7 @@
                 <w:color w:val="000000"/>
                 <w:sz w:val="20"/>
               </w:rPr>
-              <w:t>All ten GET pages returned HTTP 200. Invalid email, duplicate username, invalid image, and an image over 2 MB were rejected. Valid customer and user insert/update flows worked. A PNG upload produced a real JPEG. PHPUnit passed five tests and seven assertions. Responsive checks found no horizontal overflow at 390 pixels.</w:t>
+              <w:t>All twelve GET pages returned HTTP 200. Task creation, editing, and deletion worked with a test record. Invalid email, duplicate username, invalid image, and an image over 2 MB were rejected. Valid customer and user insert/update flows worked. A PNG upload produced a real JPEG. PHPUnit passed five tests and seven assertions. Task and user forms had no horizontal overflow at 390 pixels.</w:t>
             </w:r>
           </w:p>
         </w:tc>

</xml_diff>

<commit_message>
Write TFA3 documentation in first person and clarify GitHub submission
</commit_message>
<xml_diff>
--- a/docs/ACOB_IT0049_TFA3_MakingItEditable.docx
+++ b/docs/ACOB_IT0049_TFA3_MakingItEditable.docx
@@ -541,7 +541,7 @@
                 <w:color w:val="000000"/>
                 <w:sz w:val="20"/>
               </w:rPr>
-              <w:t>I continued my TSA1 Ledgerline Refill project and its refill-shop design. I added validated customer and staff forms, profile picture uploads, and task creation, editing, and deletion. A bottle-and-return logo image now appears in the header.</w:t>
+              <w:t>I continued my TSA1 Ledgerline Refill project and its refill-shop design. I added validated customer and staff forms, profile picture uploads, and task creation, editing, and deletion. I also made a bottle-and-return logo image for the header.</w:t>
             </w:r>
           </w:p>
         </w:tc>
@@ -621,7 +621,7 @@
                 <w:color w:val="000000"/>
                 <w:sz w:val="20"/>
               </w:rPr>
-              <w:t>Routes call controllers; controllers validate POST data and use Models to save permitted database fields. Views show escaped values, errors, and previously entered text. The Today, All tasks, Profile, and About pages remain available.</w:t>
+              <w:t>I connected each route to a controller. My controllers validate form submissions and use Models to save permitted fields. My Views escape displayed values and keep entered text when validation fails. I kept the Today, All tasks, Profile, and About pages.</w:t>
             </w:r>
           </w:p>
         </w:tc>
@@ -701,7 +701,7 @@
                 <w:color w:val="000000"/>
                 <w:sz w:val="20"/>
               </w:rPr>
-              <w:t>The TFA3 POS database has five original customers and five staff users. A separate TFA3 task database has nine tasks across four dates and one demo profile user. The original TSA1 project and databases were not changed.</w:t>
+              <w:t>I kept five original customers and five staff users in the TFA3 POS database. I placed nine tasks across four dates and one demo profile user in a separate TFA3 task database. I left my original TSA1 project and databases untouched.</w:t>
             </w:r>
           </w:p>
         </w:tc>
@@ -1529,7 +1529,7 @@
                 <w:color w:val="000000"/>
                 <w:sz w:val="20"/>
               </w:rPr>
-              <w:t>Figure 1. Today page preserves the TSA1 refill shop design and shows current work and record totals.</w:t>
+              <w:t>Figure 1. My Today page keeps the TSA1 refill shop design and shows current work and record totals.</w:t>
             </w:r>
           </w:p>
         </w:tc>
@@ -1635,7 +1635,7 @@
                 <w:color w:val="000000"/>
                 <w:sz w:val="20"/>
               </w:rPr>
-              <w:t>Figure 2. Complete task list now offers New task and Edit actions.</w:t>
+              <w:t>Figure 2. I added New task and Edit actions to my complete task list.</w:t>
             </w:r>
           </w:p>
         </w:tc>
@@ -1741,7 +1741,7 @@
                 <w:color w:val="000000"/>
                 <w:sz w:val="20"/>
               </w:rPr>
-              <w:t>Figure 3. Customer directory retains the original records and adds New customer and Edit actions.</w:t>
+              <w:t>Figure 3. I kept the original customer records and added New customer and Edit actions.</w:t>
             </w:r>
           </w:p>
         </w:tc>
@@ -1847,7 +1847,7 @@
                 <w:color w:val="000000"/>
                 <w:sz w:val="20"/>
               </w:rPr>
-              <w:t>Figure 4. New customer form asks for a required full name and valid email.</w:t>
+              <w:t>Figure 4. My new customer form asks for a full name and valid email.</w:t>
             </w:r>
           </w:p>
         </w:tc>
@@ -1953,7 +1953,7 @@
                 <w:color w:val="000000"/>
                 <w:sz w:val="20"/>
               </w:rPr>
-              <w:t>Figure 5. Invalid email shows an error while the entered full name stays in the form.</w:t>
+              <w:t>Figure 5. I show an invalid email error while keeping the full name I entered.</w:t>
             </w:r>
           </w:p>
         </w:tc>
@@ -2059,7 +2059,7 @@
                 <w:color w:val="000000"/>
                 <w:sz w:val="20"/>
               </w:rPr>
-              <w:t>Figure 6. Customer edit form loads the selected record before updating it.</w:t>
+              <w:t>Figure 6. My customer edit form loads the selected record before I update it.</w:t>
             </w:r>
           </w:p>
         </w:tc>
@@ -2165,7 +2165,7 @@
                 <w:color w:val="000000"/>
                 <w:sz w:val="20"/>
               </w:rPr>
-              <w:t>Figure 7. Staff directory shows avatars or placeholders and offers creation and editing.</w:t>
+              <w:t>Figure 7. My staff directory shows avatars or placeholders, with creation and editing actions.</w:t>
             </w:r>
           </w:p>
         </w:tc>
@@ -2271,7 +2271,7 @@
                 <w:color w:val="000000"/>
                 <w:sz w:val="20"/>
               </w:rPr>
-              <w:t>Figure 8. A duplicate username is rejected without discarding the typed full name.</w:t>
+              <w:t>Figure 8. I reject a duplicate username without discarding the full name I typed.</w:t>
             </w:r>
           </w:p>
         </w:tc>
@@ -2377,7 +2377,7 @@
                 <w:color w:val="000000"/>
                 <w:sz w:val="20"/>
               </w:rPr>
-              <w:t>Figure 9. User edit form is prefilled and accepts an optional JPG or PNG up to 2 MB.</w:t>
+              <w:t>Figure 9. My staff edit form is prefilled and accepts an optional JPG or PNG up to 2 MB.</w:t>
             </w:r>
           </w:p>
         </w:tc>
@@ -2483,7 +2483,7 @@
                 <w:color w:val="000000"/>
                 <w:sz w:val="20"/>
               </w:rPr>
-              <w:t>Figure 10. A sample initials PNG was uploaded and appears as a prepared JPEG avatar on the staff listing.</w:t>
+              <w:t>Figure 10. I uploaded a sample initials PNG, which appears as a prepared JPEG avatar on my staff listing.</w:t>
             </w:r>
           </w:p>
         </w:tc>
@@ -2634,7 +2634,7 @@
                 <w:color w:val="000000"/>
                 <w:sz w:val="20"/>
               </w:rPr>
-              <w:t>Figure 11. The user edit form becomes one column at 390 pixels with no horizontal overflow.</w:t>
+              <w:t>Figure 11. My staff edit form becomes one column at 390 pixels without horizontal overflow.</w:t>
             </w:r>
           </w:p>
         </w:tc>
@@ -2785,7 +2785,7 @@
                 <w:color w:val="000000"/>
                 <w:sz w:val="20"/>
               </w:rPr>
-              <w:t>Figure 12. The new task form accepts a title, scheduled date, and status.</w:t>
+              <w:t>Figure 12. I can enter a title, scheduled date, and status in my new task form.</w:t>
             </w:r>
           </w:p>
         </w:tc>
@@ -2891,7 +2891,7 @@
                 <w:color w:val="000000"/>
                 <w:sz w:val="20"/>
               </w:rPr>
-              <w:t>Figure 13. The task edit form loads an existing record and offers Save changes and Delete task.</w:t>
+              <w:t>Figure 13. My task edit form loads an existing record and offers Save changes and Delete task.</w:t>
             </w:r>
           </w:p>
         </w:tc>
@@ -2997,7 +2997,7 @@
                 <w:color w:val="000000"/>
                 <w:sz w:val="20"/>
               </w:rPr>
-              <w:t>Figure 14. Task editing remains usable at 390 pixels without horizontal overflow.</w:t>
+              <w:t>Figure 14. My task edit form remains usable at 390 pixels without horizontal overflow.</w:t>
             </w:r>
           </w:p>
         </w:tc>
@@ -3077,7 +3077,7 @@
                 <w:color w:val="000000"/>
                 <w:sz w:val="20"/>
               </w:rPr>
-              <w:t>The Tasks controller validates the title, date, and allowed status before saving in the separate task database. Deletion uses a POST route with CSRF protection and a confirmation. The Today page updates from the current task rows.</w:t>
+              <w:t>I validate each task title, date, and status in my Tasks controller before saving to the separate task database. I use a CSRF-protected POST route and a confirmation for deletion. My Today page reads the current task rows.</w:t>
             </w:r>
           </w:p>
         </w:tc>
@@ -3157,7 +3157,7 @@
                 <w:color w:val="000000"/>
                 <w:sz w:val="20"/>
               </w:rPr>
-              <w:t>Local checks returned five POS customer rows, five POS staff rows, nine task rows across four dates, four tasks dated today, and one task-system demo user. The sample avatar is a generated initials graphic, not a personal photograph.</w:t>
+              <w:t>I checked five POS customer rows, five POS staff rows, nine task rows across four dates, four tasks dated today, and one task-system demo user. I used a generated initials graphic for the sample avatar.</w:t>
             </w:r>
           </w:p>
         </w:tc>
@@ -3657,7 +3657,7 @@
                 <w:color w:val="000000"/>
                 <w:sz w:val="20"/>
               </w:rPr>
-              <w:t>Adds the nullable users.avatar filename column to the POS database.</w:t>
+              <w:t>I added the nullable users.avatar filename column to my POS database.</w:t>
             </w:r>
           </w:p>
         </w:tc>
@@ -3716,7 +3716,7 @@
                 <w:color w:val="000000"/>
                 <w:sz w:val="20"/>
               </w:rPr>
-              <w:t>Restrict saved columns and query the POS database.</w:t>
+              <w:t>I limited saved columns and queried my POS database through these Models.</w:t>
             </w:r>
           </w:p>
         </w:tc>
@@ -3777,7 +3777,7 @@
                 <w:color w:val="000000"/>
                 <w:sz w:val="20"/>
               </w:rPr>
-              <w:t>Read and save task records, and read the demo profile, in the separate taskStore database.</w:t>
+              <w:t>I read and save tasks, and read the demo profile, from my separate taskStore database.</w:t>
             </w:r>
           </w:p>
         </w:tc>
@@ -3836,7 +3836,7 @@
                 <w:color w:val="000000"/>
                 <w:sz w:val="20"/>
               </w:rPr>
-              <w:t>Image and MIME rules reject non-JPG/PNG files; the 2 MB rule limits size. CodeIgniter crops to 320 by 320 pixels, converts to JPEG, and stores a random filename.</w:t>
+              <w:t>I reject non-JPG/PNG files and files over 2 MB. I use CodeIgniter to crop images to 320 by 320 pixels, convert them to JPEG, and store a random filename.</w:t>
             </w:r>
           </w:p>
         </w:tc>
@@ -3961,7 +3961,7 @@
                 <w:color w:val="000000"/>
                 <w:sz w:val="20"/>
               </w:rPr>
-              <w:t>Customers require full name and valid email. Users require full name and unique username. Both forms return clear field errors and keep typed values when validation fails. Edit pages prefill existing records. POST routes use CSRF protection.</w:t>
+              <w:t>I require a full name and valid email for customers, and a full name and unique username for staff. My forms show field errors and keep entered values when validation fails. I prefill edit forms from existing records and protect POST routes with CSRF tokens.</w:t>
             </w:r>
           </w:p>
         </w:tc>
@@ -4041,7 +4041,7 @@
                 <w:color w:val="000000"/>
                 <w:sz w:val="20"/>
               </w:rPr>
-              <w:t>The user edit controller accepts JPG or PNG up to 2 MB, prepares a real 320 by 320 JPEG in public/uploads/avatars, and saves only the filename in users.avatar. The listing falls back to a placeholder when avatar is empty.</w:t>
+              <w:t>I accept JPG or PNG files up to 2 MB in the staff edit controller. I prepare a real 320 by 320 JPEG in public/uploads/avatars and save only its filename in users.avatar. I show a placeholder when no avatar is saved.</w:t>
             </w:r>
           </w:p>
         </w:tc>
@@ -4121,7 +4121,7 @@
                 <w:color w:val="000000"/>
                 <w:sz w:val="20"/>
               </w:rPr>
-              <w:t>All twelve GET pages returned HTTP 200. Task creation, editing, and deletion worked with a test record. Invalid email, duplicate username, invalid image, and an image over 2 MB were rejected. Valid customer and user insert/update flows worked. A PNG upload produced a real JPEG. PHPUnit passed five tests and seven assertions. Task and user forms had no horizontal overflow at 390 pixels.</w:t>
+              <w:t>I checked all twelve GET pages and received HTTP 200. I created, edited, and deleted a temporary task. I confirmed that invalid email, duplicate username, invalid image, and an image over 2 MB were rejected. I also tested valid customer and staff inserts and updates. My PNG upload produced a real JPEG. PHPUnit passed five tests and seven assertions. My task and staff forms had no horizontal overflow at 390 pixels.</w:t>
             </w:r>
           </w:p>
         </w:tc>
@@ -4429,65 +4429,6 @@
           </w:p>
         </w:tc>
       </w:tr>
-      <w:tr>
-        <w:trPr>
-          <w:cantSplit/>
-        </w:trPr>
-        <w:tc>
-          <w:tcPr>
-            <w:tcW w:type="dxa" w:w="2736"/>
-            <w:vAlign w:val="center"/>
-            <w:tcMar>
-              <w:top w:w="90" w:type="dxa"/>
-              <w:start w:w="110" w:type="dxa"/>
-              <w:bottom w:w="90" w:type="dxa"/>
-              <w:end w:w="110" w:type="dxa"/>
-            </w:tcMar>
-          </w:tcPr>
-          <w:p>
-            <w:pPr>
-              <w:spacing w:after="0" w:before="0"/>
-            </w:pPr>
-            <w:r/>
-            <w:r>
-              <w:rPr>
-                <w:rFonts w:ascii="Times New Roman" w:hAnsi="Times New Roman"/>
-                <w:b w:val="0"/>
-                <w:color w:val="000000"/>
-                <w:sz w:val="20"/>
-              </w:rPr>
-              <w:t>Hosted application</w:t>
-            </w:r>
-          </w:p>
-        </w:tc>
-        <w:tc>
-          <w:tcPr>
-            <w:tcW w:type="dxa" w:w="6624"/>
-            <w:vAlign w:val="center"/>
-            <w:tcMar>
-              <w:top w:w="90" w:type="dxa"/>
-              <w:start w:w="110" w:type="dxa"/>
-              <w:bottom w:w="90" w:type="dxa"/>
-              <w:end w:w="110" w:type="dxa"/>
-            </w:tcMar>
-          </w:tcPr>
-          <w:p>
-            <w:pPr>
-              <w:spacing w:after="0" w:before="0"/>
-            </w:pPr>
-            <w:r/>
-            <w:r>
-              <w:rPr>
-                <w:rFonts w:ascii="Times New Roman" w:hAnsi="Times New Roman"/>
-                <w:b w:val="0"/>
-                <w:color w:val="000000"/>
-                <w:sz w:val="20"/>
-              </w:rPr>
-              <w:t>Not published; the user chose GitHub as the publishing scope.</w:t>
-            </w:r>
-          </w:p>
-        </w:tc>
-      </w:tr>
     </w:tbl>
     <w:p>
       <w:pPr>
@@ -4563,7 +4504,7 @@
                 <w:color w:val="000000"/>
                 <w:sz w:val="20"/>
               </w:rPr>
-              <w:t>The public GitHub repository contains the CodeIgniter source, README, both SQL exports, report, and captured evidence. No hosted website URL has been verified. The activity instructions list one, so that item remains outstanding if required by the instructor.</w:t>
+              <w:t>I published my CodeIgniter source, README, both SQL exports, report, and captured evidence in the GitHub repository. GitHub publication is the submission requirement for this activity; hosting is reserved for the final project.</w:t>
             </w:r>
           </w:p>
         </w:tc>

</xml_diff>